<commit_message>
The alpha chain at summit, and the nuclear gap closed
</commit_message>
<xml_diff>
--- a/docs/rope_mass_paper.docx
+++ b/docs/rope_mass_paper.docx
@@ -64,7 +64,7 @@
     </w:p>
     <w:p>
       <w:pPr>
-        <w:spacing w:after="1200"/>
+        <w:spacing w:after="40"/>
         <w:jc w:val="center"/>
       </w:pPr>
       <w:r>
@@ -73,7 +73,23 @@
           <w:sz w:val="20"/>
           <w:szCs w:val="20"/>
         </w:rPr>
-        <w:t xml:space="preserve">Prepared for M. Palmer, Primary Investigator   ·   August 2026</w:t>
+        <w:t xml:space="preserve">Mark Palmer   ·   with computational collaboration by Claude (Anthropic)   ·   palmer100@gmail.com</w:t>
+      </w:r>
+    </w:p>
+    <w:p>
+      <w:pPr>
+        <w:spacing w:after="1200"/>
+        <w:jc w:val="center"/>
+      </w:pPr>
+      <w:r>
+        <w:rPr>
+          <w:i/>
+          <w:iCs/>
+          <w:color w:val="595959"/>
+          <w:sz w:val="18"/>
+          <w:szCs w:val="18"/>
+        </w:rPr>
+        <w:t xml:space="preserve">Programme credit: the core Rope Hypothesis is due to Bill Gaede; this corpus develops and formalises it.   ·   August 2026</w:t>
       </w:r>
     </w:p>
     <w:p>

</xml_diff>